<commit_message>
regen(5R1-lead): regenerate toan corpus sau merge laneA + manifest/allowlist sync
- build_form_maps (drop field code flatten + cat banner phu luc khac) →
  87 template + blocks M28/M80 mới; M28: 0 MERGEFORMAT, M80: 0 banner
- tag_m72_sections 16 marker OK; docx_to_blocks 87/87 blocks hợp lệ
- idempotency: run4==run5 zero-diff document.xml 87/87 (byte zip chỉ
  lệch timestamp container — đúng tầng deep idempotency)
- manifest refresh: EVOLVED_FORMS +M28/+M80 (5R1), GATE PASS 87/87
- allowlist H7 +10 file phase5 mới (docs/tools/tests)
</commit_message>
<xml_diff>
--- a/app/templates/PLII_M28.docx
+++ b/app/templates/PLII_M28.docx
@@ -696,20 +696,6 @@
           <w:sz-cs w:val="24"/>
         </w:rPr>
         <w:t xml:space="preserve"/>
-      </w:r>
-    </w:p>
-    <w:p>
-      <w:pPr>
-        <w:jc w:val="center"/>
-        <w:spacing w:after="120"/>
-      </w:pPr>
-      <w:r>
-        <w:rPr>
-          <w:rFonts w:ascii="Times New Roman" w:hAnsi="Times New Roman" w:cs="Times New Roman"/>
-          <w:sz w:val="28"/>
-          <w:sz-cs w:val="28"/>
-        </w:rPr>
-        <w:t xml:space="preserve"> PAGE   \* MERGEFORMAT 2</w:t>
       </w:r>
     </w:p>
     <w:p>

</xml_diff>